<commit_message>
Add line chart to Khmer civic summary
</commit_message>
<xml_diff>
--- a/khmer_inscription_analysis/outputs/khmer_buddhism_civic_summary_ja.docx
+++ b/khmer_inscription_analysis/outputs/khmer_buddhism_civic_summary_ja.docx
@@ -4,7 +4,7 @@
   <w:body>
     <w:p>
       <w:pPr>
-        <w:spacing w:after="80"/>
+        <w:spacing w:after="40"/>
         <w:jc w:val="center"/>
       </w:pPr>
       <w:r>
@@ -12,14 +12,14 @@
           <w:rFonts w:ascii="Yu Gothic" w:hAnsi="Yu Gothic" w:eastAsia="Yu Gothic"/>
           <w:b/>
           <w:color w:val="1F4E79"/>
-          <w:sz w:val="32"/>
+          <w:sz w:val="30"/>
         </w:rPr>
         <w:t>クメール碑文から見る仏教のうつりかわり</w:t>
       </w:r>
     </w:p>
     <w:p>
       <w:pPr>
-        <w:spacing w:after="100"/>
+        <w:spacing w:after="60"/>
         <w:jc w:val="center"/>
       </w:pPr>
       <w:r>
@@ -27,77 +27,145 @@
           <w:rFonts w:ascii="Yu Gothic" w:hAnsi="Yu Gothic" w:eastAsia="Yu Gothic"/>
           <w:b w:val="0"/>
           <w:color w:val="595959"/>
-          <w:sz w:val="19"/>
+          <w:sz w:val="17"/>
         </w:rPr>
         <w:t>市民向けまとめ（A4 1枚）</w:t>
       </w:r>
     </w:p>
     <w:p>
       <w:pPr>
-        <w:spacing w:after="100" w:line="240" w:lineRule="auto"/>
+        <w:spacing w:after="60" w:line="228" w:lineRule="auto"/>
         <w:shd w:fill="EAF2F8"/>
       </w:pPr>
       <w:r>
         <w:rPr>
           <w:rFonts w:ascii="Yu Gothic" w:hAnsi="Yu Gothic" w:eastAsia="Yu Gothic"/>
           <w:b w:val="0"/>
-          <w:sz w:val="18"/>
+          <w:sz w:val="17"/>
         </w:rPr>
-        <w:t>この調査は、カンボジア周辺に残るクメール碑文の言葉を手がかりに、「大乗仏教の語彙」がいつ現れ、その後「上座部仏教につながる語彙」へどう移っていくのかを探る予備調査です。宗教の歴史を、王や戦争だけでなく、石に刻まれた日常の言葉から読み直す試みです。</w:t>
+        <w:t>この調査は、カンボジア周辺に残るクメール碑文の言葉を手がかりに、「大乗仏教の語彙」がいつ現れ、その後「上座部仏教につながる語彙」へどう移っていくのかを探る予備調査です。</w:t>
       </w:r>
     </w:p>
     <w:p>
       <w:pPr>
-        <w:spacing w:before="80" w:after="20"/>
+        <w:spacing w:before="40" w:after="0"/>
       </w:pPr>
       <w:r>
         <w:rPr>
           <w:rFonts w:ascii="Yu Gothic" w:hAnsi="Yu Gothic" w:eastAsia="Yu Gothic"/>
           <w:b/>
           <w:color w:val="1F4E79"/>
-          <w:sz w:val="22"/>
+          <w:sz w:val="20"/>
         </w:rPr>
         <w:t>何を調べたのか</w:t>
       </w:r>
     </w:p>
     <w:p>
       <w:pPr>
-        <w:spacing w:line="240" w:lineRule="auto" w:before="0" w:after="40"/>
+        <w:spacing w:line="228" w:lineRule="auto" w:before="0" w:after="24"/>
       </w:pPr>
       <w:r>
         <w:rPr>
           <w:rFonts w:ascii="Yu Gothic" w:hAnsi="Yu Gothic" w:eastAsia="Yu Gothic"/>
           <w:b w:val="0"/>
-          <w:sz w:val="18"/>
+          <w:sz w:val="16"/>
         </w:rPr>
-        <w:t>公開されている SEAlang「クメール碑文コーパス」を使い、6〜19世紀の碑文に出る宗教語を検索しました。対象語は、大乗系（例：lokeśvara＝観音系の尊格、bodhisattva＝菩薩、vajra＝金剛）、仏教一般語（buddha、saṅgha など）、上座部・パーリ語系（thera、sāsana など）、比較用のシヴァ派・ヴィシュヌ派・バラモン系語彙です。</w:t>
+        <w:t>公開されている SEAlang「クメール碑文コーパス」を使い、6〜19世紀の碑文に出る宗教語を検索しました。対象語は、大乗系（lokeśvara＝観音系の尊格、bodhisattva＝菩薩、vajra＝金剛）、仏教一般語（buddha、saṅgha など）、上座部・パーリ語系（thera、sāsana など）、比較用のヒンドゥー系語彙です。</w:t>
       </w:r>
     </w:p>
     <w:p>
       <w:pPr>
-        <w:spacing w:before="80" w:after="20"/>
+        <w:spacing w:before="40" w:after="0"/>
       </w:pPr>
       <w:r>
         <w:rPr>
           <w:rFonts w:ascii="Yu Gothic" w:hAnsi="Yu Gothic" w:eastAsia="Yu Gothic"/>
           <w:b/>
           <w:color w:val="1F4E79"/>
-          <w:sz w:val="22"/>
+          <w:sz w:val="20"/>
         </w:rPr>
         <w:t>見えてきたこと</w:t>
       </w:r>
     </w:p>
     <w:p>
       <w:pPr>
-        <w:spacing w:line="240" w:lineRule="auto" w:after="20"/>
-        <w:ind w:left="255" w:hanging="142"/>
+        <w:spacing w:line="228" w:lineRule="auto" w:before="0" w:after="24"/>
+      </w:pPr>
+      <w:r>
+        <w:rPr>
+          <w:rFonts w:ascii="Yu Gothic" w:hAnsi="Yu Gothic" w:eastAsia="Yu Gothic"/>
+          <w:b w:val="0"/>
+          <w:sz w:val="16"/>
+        </w:rPr>
+        <w:t>図1に示すように、大乗系の語は主に9〜12世紀に見られ、上座部仏教につながる thera や sāsana は13〜14世紀以降に少数ながら確認されました。</w:t>
+      </w:r>
+    </w:p>
+    <w:p>
+      <w:pPr>
+        <w:spacing w:before="20" w:after="20"/>
+        <w:jc w:val="center"/>
+      </w:pPr>
+      <w:r>
+        <w:drawing>
+          <wp:inline xmlns:a="http://schemas.openxmlformats.org/drawingml/2006/main" xmlns:pic="http://schemas.openxmlformats.org/drawingml/2006/picture">
+            <wp:extent cx="4572000" cy="1813734"/>
+            <wp:docPr id="1" name="Picture 1"/>
+            <wp:cNvGraphicFramePr>
+              <a:graphicFrameLocks noChangeAspect="1"/>
+            </wp:cNvGraphicFramePr>
+            <a:graphic>
+              <a:graphicData uri="http://schemas.openxmlformats.org/drawingml/2006/picture">
+                <pic:pic>
+                  <pic:nvPicPr>
+                    <pic:cNvPr id="0" name="khmer_buddhist_terms_line_ja.png"/>
+                    <pic:cNvPicPr/>
+                  </pic:nvPicPr>
+                  <pic:blipFill>
+                    <a:blip r:embed="rId9"/>
+                    <a:stretch>
+                      <a:fillRect/>
+                    </a:stretch>
+                  </pic:blipFill>
+                  <pic:spPr>
+                    <a:xfrm>
+                      <a:off x="0" y="0"/>
+                      <a:ext cx="4572000" cy="1813734"/>
+                    </a:xfrm>
+                    <a:prstGeom prst="rect"/>
+                  </pic:spPr>
+                </pic:pic>
+              </a:graphicData>
+            </a:graphic>
+          </wp:inline>
+        </w:drawing>
+      </w:r>
+    </w:p>
+    <w:p>
+      <w:pPr>
+        <w:spacing w:after="40"/>
+        <w:jc w:val="center"/>
+      </w:pPr>
+      <w:r>
+        <w:rPr>
+          <w:rFonts w:ascii="Yu Gothic" w:hAnsi="Yu Gothic" w:eastAsia="Yu Gothic"/>
+          <w:b w:val="0"/>
+          <w:color w:val="595959"/>
+          <w:sz w:val="14"/>
+        </w:rPr>
+        <w:t>図1　クメール碑文に見える仏教語彙の時代変化（検索語の出現数）</w:t>
+      </w:r>
+    </w:p>
+    <w:p>
+      <w:pPr>
+        <w:spacing w:line="228" w:lineRule="auto" w:after="8"/>
+        <w:ind w:left="238" w:hanging="136"/>
       </w:pPr>
       <w:r>
         <w:rPr>
           <w:rFonts w:ascii="Yu Gothic" w:hAnsi="Yu Gothic" w:eastAsia="Yu Gothic"/>
           <w:b/>
           <w:color w:val="1F4E79"/>
-          <w:sz w:val="18"/>
+          <w:sz w:val="16"/>
         </w:rPr>
         <w:t xml:space="preserve">• </w:t>
       </w:r>
@@ -105,22 +173,22 @@
         <w:rPr>
           <w:rFonts w:ascii="Yu Gothic" w:hAnsi="Yu Gothic" w:eastAsia="Yu Gothic"/>
           <w:b w:val="0"/>
-          <w:sz w:val="18"/>
+          <w:sz w:val="16"/>
         </w:rPr>
-        <w:t>大乗系の語は、今回の検索では主に9〜12世紀に見られました。特に lokeśvara は10〜11世紀、bodhisattva や mahābodhi は12世紀の碑文に現れます。</w:t>
+        <w:t>lokeśvara は10〜11世紀、bodhisattva や mahābodhi は12世紀の碑文に現れます。</w:t>
       </w:r>
     </w:p>
     <w:p>
       <w:pPr>
-        <w:spacing w:line="240" w:lineRule="auto" w:after="20"/>
-        <w:ind w:left="255" w:hanging="142"/>
+        <w:spacing w:line="228" w:lineRule="auto" w:after="8"/>
+        <w:ind w:left="238" w:hanging="136"/>
       </w:pPr>
       <w:r>
         <w:rPr>
           <w:rFonts w:ascii="Yu Gothic" w:hAnsi="Yu Gothic" w:eastAsia="Yu Gothic"/>
           <w:b/>
           <w:color w:val="1F4E79"/>
-          <w:sz w:val="18"/>
+          <w:sz w:val="16"/>
         </w:rPr>
         <w:t xml:space="preserve">• </w:t>
       </w:r>
@@ -128,22 +196,22 @@
         <w:rPr>
           <w:rFonts w:ascii="Yu Gothic" w:hAnsi="Yu Gothic" w:eastAsia="Yu Gothic"/>
           <w:b w:val="0"/>
-          <w:sz w:val="18"/>
+          <w:sz w:val="16"/>
         </w:rPr>
-        <w:t>上座部仏教につながる thera や sāsana は、13〜14世紀以降に少数ながら確認されました。これは、語彙の面でも後の時代に重心が移る可能性を示します。</w:t>
+        <w:t>thera や sāsana は後の時代に現れ、語彙の面でも重心が移る可能性を示します。</w:t>
       </w:r>
     </w:p>
     <w:p>
       <w:pPr>
-        <w:spacing w:line="240" w:lineRule="auto" w:after="20"/>
-        <w:ind w:left="255" w:hanging="142"/>
+        <w:spacing w:line="228" w:lineRule="auto" w:after="8"/>
+        <w:ind w:left="238" w:hanging="136"/>
       </w:pPr>
       <w:r>
         <w:rPr>
           <w:rFonts w:ascii="Yu Gothic" w:hAnsi="Yu Gothic" w:eastAsia="Yu Gothic"/>
           <w:b/>
           <w:color w:val="1F4E79"/>
-          <w:sz w:val="18"/>
+          <w:sz w:val="16"/>
         </w:rPr>
         <w:t xml:space="preserve">• </w:t>
       </w:r>
@@ -151,90 +219,90 @@
         <w:rPr>
           <w:rFonts w:ascii="Yu Gothic" w:hAnsi="Yu Gothic" w:eastAsia="Yu Gothic"/>
           <w:b w:val="0"/>
-          <w:sz w:val="18"/>
+          <w:sz w:val="16"/>
         </w:rPr>
-        <w:t>ただし、liṅga、śiva、viṣṇu、deva などヒンドゥー系・バラモン系の語は、仏教語彙より多く出ます。当時の宗教文化は単純な「仏教だけ」の世界ではなく、複数の伝統が重なっていたと考えられます。</w:t>
+        <w:t>一方で liṅga、śiva、viṣṇu、deva などの語は多く、当時の宗教文化は複数の伝統が重なる世界でした。</w:t>
       </w:r>
     </w:p>
     <w:p>
       <w:pPr>
-        <w:spacing w:before="80" w:after="20"/>
+        <w:spacing w:before="40" w:after="0"/>
       </w:pPr>
       <w:r>
         <w:rPr>
           <w:rFonts w:ascii="Yu Gothic" w:hAnsi="Yu Gothic" w:eastAsia="Yu Gothic"/>
           <w:b/>
           <w:color w:val="1F4E79"/>
-          <w:sz w:val="22"/>
+          <w:sz w:val="20"/>
         </w:rPr>
         <w:t>この結果をどう読むか</w:t>
       </w:r>
     </w:p>
     <w:p>
       <w:pPr>
-        <w:spacing w:line="240" w:lineRule="auto" w:before="0" w:after="40"/>
+        <w:spacing w:line="228" w:lineRule="auto" w:before="0" w:after="24"/>
       </w:pPr>
       <w:r>
         <w:rPr>
           <w:rFonts w:ascii="Yu Gothic" w:hAnsi="Yu Gothic" w:eastAsia="Yu Gothic"/>
           <w:b w:val="0"/>
-          <w:sz w:val="18"/>
+          <w:sz w:val="16"/>
         </w:rPr>
-        <w:t>今回の結果は、「大乗仏教が突然消え、上座部仏教に置き換わった」と断定するものではありません。むしろ、9〜12世紀に大乗系の語が見え、その後13〜14世紀に上座部・パーリ語系の語が見え始める、というゆるやかな変化の見取り図です。人びとの信仰や寺院制度は、古い語彙を残しながら新しい語彙を取り入れていった可能性があります。</w:t>
+        <w:t>今回の結果は、「大乗仏教が突然消え、上座部仏教に置き換わった」と断定するものではありません。むしろ、古い語彙を残しながら新しい語彙を取り入れる、ゆるやかな変化の見取り図です。</w:t>
       </w:r>
     </w:p>
     <w:p>
       <w:pPr>
-        <w:spacing w:before="80" w:after="20"/>
+        <w:spacing w:before="40" w:after="0"/>
       </w:pPr>
       <w:r>
         <w:rPr>
           <w:rFonts w:ascii="Yu Gothic" w:hAnsi="Yu Gothic" w:eastAsia="Yu Gothic"/>
           <w:b/>
           <w:color w:val="1F4E79"/>
-          <w:sz w:val="22"/>
+          <w:sz w:val="20"/>
         </w:rPr>
         <w:t>市民にとっての意義</w:t>
       </w:r>
     </w:p>
     <w:p>
       <w:pPr>
-        <w:spacing w:line="240" w:lineRule="auto" w:before="0" w:after="40"/>
+        <w:spacing w:line="228" w:lineRule="auto" w:before="0" w:after="24"/>
       </w:pPr>
       <w:r>
         <w:rPr>
           <w:rFonts w:ascii="Yu Gothic" w:hAnsi="Yu Gothic" w:eastAsia="Yu Gothic"/>
           <w:b w:val="0"/>
-          <w:sz w:val="18"/>
+          <w:sz w:val="16"/>
         </w:rPr>
-        <w:t>碑文の言葉を数えることで、東南アジアの宗教史を「有名な王朝史」だけでなく、地域社会に残された文字資料から考えられます。これは、仏教がインドから東南アジアへ伝わっただけでなく、現地社会の言葉・制度・信仰の中で形を変えながら根づいたことを示す入口になります。</w:t>
+        <w:t>碑文の言葉を数えることで、東南アジアの宗教史を王朝史だけでなく、地域社会に残された文字資料から考えられます。仏教が現地社会の言葉・制度・信仰の中で形を変えながら根づいたことを考える入口になります。</w:t>
       </w:r>
     </w:p>
     <w:p>
       <w:pPr>
-        <w:spacing w:before="80" w:after="20"/>
+        <w:spacing w:before="40" w:after="0"/>
       </w:pPr>
       <w:r>
         <w:rPr>
           <w:rFonts w:ascii="Yu Gothic" w:hAnsi="Yu Gothic" w:eastAsia="Yu Gothic"/>
           <w:b/>
           <w:color w:val="1F4E79"/>
-          <w:sz w:val="22"/>
+          <w:sz w:val="20"/>
         </w:rPr>
         <w:t>注意点</w:t>
       </w:r>
     </w:p>
     <w:p>
       <w:pPr>
-        <w:spacing w:line="240" w:lineRule="auto" w:after="20"/>
-        <w:ind w:left="255" w:hanging="142"/>
+        <w:spacing w:line="228" w:lineRule="auto" w:after="8"/>
+        <w:ind w:left="238" w:hanging="136"/>
       </w:pPr>
       <w:r>
         <w:rPr>
           <w:rFonts w:ascii="Yu Gothic" w:hAnsi="Yu Gothic" w:eastAsia="Yu Gothic"/>
           <w:b/>
           <w:color w:val="1F4E79"/>
-          <w:sz w:val="18"/>
+          <w:sz w:val="16"/>
         </w:rPr>
         <w:t xml:space="preserve">• </w:t>
       </w:r>
@@ -242,22 +310,22 @@
         <w:rPr>
           <w:rFonts w:ascii="Yu Gothic" w:hAnsi="Yu Gothic" w:eastAsia="Yu Gothic"/>
           <w:b w:val="0"/>
-          <w:sz w:val="18"/>
+          <w:sz w:val="16"/>
         </w:rPr>
         <w:t>使ったコーパスは公開デモ版で、本文は未校正・不完全な部分があります。</w:t>
       </w:r>
     </w:p>
     <w:p>
       <w:pPr>
-        <w:spacing w:line="240" w:lineRule="auto" w:after="20"/>
-        <w:ind w:left="255" w:hanging="142"/>
+        <w:spacing w:line="228" w:lineRule="auto" w:after="8"/>
+        <w:ind w:left="238" w:hanging="136"/>
       </w:pPr>
       <w:r>
         <w:rPr>
           <w:rFonts w:ascii="Yu Gothic" w:hAnsi="Yu Gothic" w:eastAsia="Yu Gothic"/>
           <w:b/>
           <w:color w:val="1F4E79"/>
-          <w:sz w:val="18"/>
+          <w:sz w:val="16"/>
         </w:rPr>
         <w:t xml:space="preserve">• </w:t>
       </w:r>
@@ -265,22 +333,22 @@
         <w:rPr>
           <w:rFonts w:ascii="Yu Gothic" w:hAnsi="Yu Gothic" w:eastAsia="Yu Gothic"/>
           <w:b w:val="0"/>
-          <w:sz w:val="18"/>
+          <w:sz w:val="16"/>
         </w:rPr>
         <w:t>検索語は代表例に限られます。異表記や同義語を増やすと結果は変わる可能性があります。</w:t>
       </w:r>
     </w:p>
     <w:p>
       <w:pPr>
-        <w:spacing w:line="240" w:lineRule="auto" w:after="20"/>
-        <w:ind w:left="255" w:hanging="142"/>
+        <w:spacing w:line="228" w:lineRule="auto" w:after="8"/>
+        <w:ind w:left="238" w:hanging="136"/>
       </w:pPr>
       <w:r>
         <w:rPr>
           <w:rFonts w:ascii="Yu Gothic" w:hAnsi="Yu Gothic" w:eastAsia="Yu Gothic"/>
           <w:b/>
           <w:color w:val="1F4E79"/>
-          <w:sz w:val="18"/>
+          <w:sz w:val="16"/>
         </w:rPr>
         <w:t xml:space="preserve">• </w:t>
       </w:r>
@@ -288,28 +356,28 @@
         <w:rPr>
           <w:rFonts w:ascii="Yu Gothic" w:hAnsi="Yu Gothic" w:eastAsia="Yu Gothic"/>
           <w:b w:val="0"/>
-          <w:sz w:val="18"/>
+          <w:sz w:val="16"/>
         </w:rPr>
-        <w:t>したがって、これは最終結論ではなく、今後どの碑文を詳しく読むべきかを決めるための地図です。</w:t>
+        <w:t>これは最終結論ではなく、今後どの碑文を詳しく読むべきかを決めるための地図です。</w:t>
       </w:r>
     </w:p>
     <w:p>
       <w:pPr>
-        <w:spacing w:before="100" w:after="0" w:line="240" w:lineRule="auto"/>
+        <w:spacing w:before="40" w:after="0" w:line="216" w:lineRule="auto"/>
       </w:pPr>
       <w:r>
         <w:rPr>
           <w:rFonts w:ascii="Yu Gothic" w:hAnsi="Yu Gothic" w:eastAsia="Yu Gothic"/>
           <w:b w:val="0"/>
           <w:color w:val="595959"/>
-          <w:sz w:val="16"/>
+          <w:sz w:val="14"/>
         </w:rPr>
         <w:t>出典・方法：SEAlang Corpus of Khmer Inscriptions（公開クエリ）を用いたパイロット解析。検索結果は bougtoir/wip の khmer_inscription_analysis に保存。</w:t>
       </w:r>
     </w:p>
     <w:sectPr>
       <w:pgSz w:w="11906" w:h="16838"/>
-      <w:pgMar w:top="822" w:right="879" w:bottom="765" w:left="879" w:header="720" w:footer="720" w:gutter="0"/>
+      <w:pgMar w:top="595" w:right="765" w:bottom="567" w:left="765" w:header="720" w:footer="720" w:gutter="0"/>
       <w:cols w:space="720"/>
       <w:docGrid w:linePitch="360"/>
     </w:sectPr>
@@ -682,7 +750,7 @@
     <w:rsid w:val="00FC693F"/>
     <w:rPr>
       <w:rFonts w:ascii="Yu Gothic" w:hAnsi="Yu Gothic" w:eastAsia="Yu Gothic"/>
-      <w:sz w:val="18"/>
+      <w:sz w:val="17"/>
     </w:rPr>
   </w:style>
   <w:style w:type="paragraph" w:styleId="Header">

</xml_diff>

<commit_message>
Clarify hit count units in Khmer summary
</commit_message>
<xml_diff>
--- a/khmer_inscription_analysis/outputs/khmer_buddhism_civic_summary_ja.docx
+++ b/khmer_inscription_analysis/outputs/khmer_buddhism_civic_summary_ja.docx
@@ -97,7 +97,7 @@
           <w:b w:val="0"/>
           <w:sz w:val="16"/>
         </w:rPr>
-        <w:t>図1に示すように、大乗系の語は主に9〜12世紀に見られ、上座部仏教につながる thera や sāsana は13〜14世紀以降に少数ながら確認されました。</w:t>
+        <w:t>図1に示すように、大乗系の語は主に9〜12世紀に見られ、上座部仏教につながる thera や sāsana は13〜14世紀以降に少数ながら確認されました。ここでの出現数は、SEAlang検索でのヒット数で、1は語が1回出たことを表します。</w:t>
       </w:r>
     </w:p>
     <w:p>
@@ -152,7 +152,7 @@
           <w:color w:val="595959"/>
           <w:sz w:val="14"/>
         </w:rPr>
-        <w:t>図1　クメール碑文に見える仏教語彙の時代変化（検索語の出現数）</w:t>
+        <w:t>図1　クメール碑文に見える仏教語彙の時代変化（検索ヒット数：1＝語の出現1回）</w:t>
       </w:r>
     </w:p>
     <w:p>

</xml_diff>

<commit_message>
Expand Khmer Buddhist term variants
</commit_message>
<xml_diff>
--- a/khmer_inscription_analysis/outputs/khmer_buddhism_civic_summary_ja.docx
+++ b/khmer_inscription_analysis/outputs/khmer_buddhism_civic_summary_ja.docx
@@ -19,7 +19,7 @@
     </w:p>
     <w:p>
       <w:pPr>
-        <w:spacing w:after="60"/>
+        <w:spacing w:after="40"/>
         <w:jc w:val="center"/>
       </w:pPr>
       <w:r>
@@ -27,42 +27,15 @@
           <w:rFonts w:ascii="Yu Gothic" w:hAnsi="Yu Gothic" w:eastAsia="Yu Gothic"/>
           <w:b w:val="0"/>
           <w:color w:val="595959"/>
-          <w:sz w:val="17"/>
+          <w:sz w:val="16"/>
         </w:rPr>
         <w:t>市民向けまとめ（A4 1枚）</w:t>
       </w:r>
     </w:p>
     <w:p>
       <w:pPr>
-        <w:spacing w:after="60" w:line="228" w:lineRule="auto"/>
+        <w:spacing w:after="50" w:line="221" w:lineRule="auto"/>
         <w:shd w:fill="EAF2F8"/>
-      </w:pPr>
-      <w:r>
-        <w:rPr>
-          <w:rFonts w:ascii="Yu Gothic" w:hAnsi="Yu Gothic" w:eastAsia="Yu Gothic"/>
-          <w:b w:val="0"/>
-          <w:sz w:val="17"/>
-        </w:rPr>
-        <w:t>この調査は、カンボジア周辺に残るクメール碑文の言葉を手がかりに、「大乗仏教の語彙」がいつ現れ、その後「上座部仏教につながる語彙」へどう移っていくのかを探る予備調査です。</w:t>
-      </w:r>
-    </w:p>
-    <w:p>
-      <w:pPr>
-        <w:spacing w:before="40" w:after="0"/>
-      </w:pPr>
-      <w:r>
-        <w:rPr>
-          <w:rFonts w:ascii="Yu Gothic" w:hAnsi="Yu Gothic" w:eastAsia="Yu Gothic"/>
-          <w:b/>
-          <w:color w:val="1F4E79"/>
-          <w:sz w:val="20"/>
-        </w:rPr>
-        <w:t>何を調べたのか</w:t>
-      </w:r>
-    </w:p>
-    <w:p>
-      <w:pPr>
-        <w:spacing w:line="228" w:lineRule="auto" w:before="0" w:after="24"/>
       </w:pPr>
       <w:r>
         <w:rPr>
@@ -70,26 +43,26 @@
           <w:b w:val="0"/>
           <w:sz w:val="16"/>
         </w:rPr>
-        <w:t>公開されている SEAlang「クメール碑文コーパス」を使い、6〜19世紀の碑文に出る宗教語を検索しました。対象語は、大乗系（lokeśvara＝観音系の尊格、bodhisattva＝菩薩、vajra＝金剛）、仏教一般語（buddha、saṅgha など）、上座部・パーリ語系（thera、sāsana など）、比較用のヒンドゥー系語彙です。</w:t>
+        <w:t>この調査は、カンボジア周辺に残るクメール碑文の言葉を手がかりに、「大乗仏教の語彙」がいつ現れ、その後「上座部仏教や僧団制度につながる語彙」へどう移っていくのかを探る予備調査です。</w:t>
       </w:r>
     </w:p>
     <w:p>
       <w:pPr>
-        <w:spacing w:before="40" w:after="0"/>
+        <w:spacing w:before="32" w:after="0"/>
       </w:pPr>
       <w:r>
         <w:rPr>
           <w:rFonts w:ascii="Yu Gothic" w:hAnsi="Yu Gothic" w:eastAsia="Yu Gothic"/>
           <w:b/>
           <w:color w:val="1F4E79"/>
-          <w:sz w:val="20"/>
+          <w:sz w:val="19"/>
         </w:rPr>
-        <w:t>見えてきたこと</w:t>
+        <w:t>何を調べたのか</w:t>
       </w:r>
     </w:p>
     <w:p>
       <w:pPr>
-        <w:spacing w:line="228" w:lineRule="auto" w:before="0" w:after="24"/>
+        <w:spacing w:line="221" w:lineRule="auto" w:before="0" w:after="18"/>
       </w:pPr>
       <w:r>
         <w:rPr>
@@ -97,18 +70,45 @@
           <w:b w:val="0"/>
           <w:sz w:val="16"/>
         </w:rPr>
-        <w:t>図1に示すように、大乗系の語は主に9〜12世紀に見られ、上座部仏教につながる thera や sāsana は13〜14世紀以降に少数ながら確認されました。ここでの出現数は、SEAlang検索でのヒット数で、1は語が1回出たことを表します。</w:t>
+        <w:t>公開されている SEAlang「クメール碑文コーパス」を使い、6〜19世紀の碑文に出る宗教語を検索しました。母数は669碑文・約100万語と説明されていますが、総文字数そのものは公開画面では確認できません。今回は表記揺れや近い語も含め、観音・ロケーシュヴァラ系、菩薩・菩提系、金剛系、長老・比丘・僧団系、仏教制度・伝承系など33検索語をグループ化しました。</w:t>
       </w:r>
     </w:p>
     <w:p>
       <w:pPr>
-        <w:spacing w:before="20" w:after="20"/>
+        <w:spacing w:before="32" w:after="0"/>
+      </w:pPr>
+      <w:r>
+        <w:rPr>
+          <w:rFonts w:ascii="Yu Gothic" w:hAnsi="Yu Gothic" w:eastAsia="Yu Gothic"/>
+          <w:b/>
+          <w:color w:val="1F4E79"/>
+          <w:sz w:val="19"/>
+        </w:rPr>
+        <w:t>見えてきたこと</w:t>
+      </w:r>
+    </w:p>
+    <w:p>
+      <w:pPr>
+        <w:spacing w:line="221" w:lineRule="auto" w:before="0" w:after="18"/>
+      </w:pPr>
+      <w:r>
+        <w:rPr>
+          <w:rFonts w:ascii="Yu Gothic" w:hAnsi="Yu Gothic" w:eastAsia="Yu Gothic"/>
+          <w:b w:val="0"/>
+          <w:sz w:val="16"/>
+        </w:rPr>
+        <w:t>図1に示すように、表記揺れ・近い語を許容して数え直すと、大乗系語彙は計27回、上座部・僧団系語彙は計23回、仏教一般語彙は計6回でした。ここでの出現数は、同一碑文内の重複も含めたSEAlang検索ヒット数で、1は語が1回出たことを表します。</w:t>
+      </w:r>
+    </w:p>
+    <w:p>
+      <w:pPr>
+        <w:spacing w:before="10" w:after="10"/>
         <w:jc w:val="center"/>
       </w:pPr>
       <w:r>
         <w:drawing>
           <wp:inline xmlns:a="http://schemas.openxmlformats.org/drawingml/2006/main" xmlns:pic="http://schemas.openxmlformats.org/drawingml/2006/picture">
-            <wp:extent cx="4572000" cy="1813734"/>
+            <wp:extent cx="4536000" cy="1764783"/>
             <wp:docPr id="1" name="Picture 1"/>
             <wp:cNvGraphicFramePr>
               <a:graphicFrameLocks noChangeAspect="1"/>
@@ -129,7 +129,7 @@
                   <pic:spPr>
                     <a:xfrm>
                       <a:off x="0" y="0"/>
-                      <a:ext cx="4572000" cy="1813734"/>
+                      <a:ext cx="4536000" cy="1764783"/>
                     </a:xfrm>
                     <a:prstGeom prst="rect"/>
                   </pic:spPr>
@@ -142,7 +142,7 @@
     </w:p>
     <w:p>
       <w:pPr>
-        <w:spacing w:after="40"/>
+        <w:spacing w:after="28"/>
         <w:jc w:val="center"/>
       </w:pPr>
       <w:r>
@@ -152,12 +152,12 @@
           <w:color w:val="595959"/>
           <w:sz w:val="14"/>
         </w:rPr>
-        <w:t>図1　クメール碑文に見える仏教語彙の時代変化（検索ヒット数：1＝語の出現1回）</w:t>
+        <w:t>図1　表記揺れ・近い語を含めた仏教語彙の時代変化（検索ヒット数：1＝語の出現1回）</w:t>
       </w:r>
     </w:p>
     <w:p>
       <w:pPr>
-        <w:spacing w:line="228" w:lineRule="auto" w:after="8"/>
+        <w:spacing w:line="221" w:lineRule="auto" w:after="5"/>
         <w:ind w:left="238" w:hanging="136"/>
       </w:pPr>
       <w:r>
@@ -165,7 +165,7 @@
           <w:rFonts w:ascii="Yu Gothic" w:hAnsi="Yu Gothic" w:eastAsia="Yu Gothic"/>
           <w:b/>
           <w:color w:val="1F4E79"/>
-          <w:sz w:val="16"/>
+          <w:sz w:val="15"/>
         </w:rPr>
         <w:t xml:space="preserve">• </w:t>
       </w:r>
@@ -173,14 +173,14 @@
         <w:rPr>
           <w:rFonts w:ascii="Yu Gothic" w:hAnsi="Yu Gothic" w:eastAsia="Yu Gothic"/>
           <w:b w:val="0"/>
-          <w:sz w:val="16"/>
+          <w:sz w:val="15"/>
         </w:rPr>
-        <w:t>lokeśvara は10〜11世紀、bodhisattva や mahābodhi は12世紀の碑文に現れます。</w:t>
+        <w:t>大乗系語彙は10〜12世紀に厚く、lokeśvara 系や vajra 系の複合語が増えます。</w:t>
       </w:r>
     </w:p>
     <w:p>
       <w:pPr>
-        <w:spacing w:line="228" w:lineRule="auto" w:after="8"/>
+        <w:spacing w:line="221" w:lineRule="auto" w:after="5"/>
         <w:ind w:left="238" w:hanging="136"/>
       </w:pPr>
       <w:r>
@@ -188,7 +188,7 @@
           <w:rFonts w:ascii="Yu Gothic" w:hAnsi="Yu Gothic" w:eastAsia="Yu Gothic"/>
           <w:b/>
           <w:color w:val="1F4E79"/>
-          <w:sz w:val="16"/>
+          <w:sz w:val="15"/>
         </w:rPr>
         <w:t xml:space="preserve">• </w:t>
       </w:r>
@@ -196,14 +196,14 @@
         <w:rPr>
           <w:rFonts w:ascii="Yu Gothic" w:hAnsi="Yu Gothic" w:eastAsia="Yu Gothic"/>
           <w:b w:val="0"/>
-          <w:sz w:val="16"/>
+          <w:sz w:val="15"/>
         </w:rPr>
-        <w:t>thera や sāsana は後の時代に現れ、語彙の面でも重心が移る可能性を示します。</w:t>
+        <w:t>上座部・僧団系語彙は12世紀以降に伸び、13〜14世紀に thera、saṅgha、bhikṣusaṅgha、sāsana などが目立ちます。</w:t>
       </w:r>
     </w:p>
     <w:p>
       <w:pPr>
-        <w:spacing w:line="228" w:lineRule="auto" w:after="8"/>
+        <w:spacing w:line="221" w:lineRule="auto" w:after="5"/>
         <w:ind w:left="238" w:hanging="136"/>
       </w:pPr>
       <w:r>
@@ -211,7 +211,7 @@
           <w:rFonts w:ascii="Yu Gothic" w:hAnsi="Yu Gothic" w:eastAsia="Yu Gothic"/>
           <w:b/>
           <w:color w:val="1F4E79"/>
-          <w:sz w:val="16"/>
+          <w:sz w:val="15"/>
         </w:rPr>
         <w:t xml:space="preserve">• </w:t>
       </w:r>
@@ -219,28 +219,28 @@
         <w:rPr>
           <w:rFonts w:ascii="Yu Gothic" w:hAnsi="Yu Gothic" w:eastAsia="Yu Gothic"/>
           <w:b w:val="0"/>
-          <w:sz w:val="16"/>
+          <w:sz w:val="15"/>
         </w:rPr>
-        <w:t>一方で liṅga、śiva、viṣṇu、deva などの語は多く、当時の宗教文化は複数の伝統が重なる世界でした。</w:t>
+        <w:t>ただし、比丘・僧団語は上座部だけを直接証明する語ではなく、制度変化を読むための手がかりです。</w:t>
       </w:r>
     </w:p>
     <w:p>
       <w:pPr>
-        <w:spacing w:before="40" w:after="0"/>
+        <w:spacing w:before="32" w:after="0"/>
       </w:pPr>
       <w:r>
         <w:rPr>
           <w:rFonts w:ascii="Yu Gothic" w:hAnsi="Yu Gothic" w:eastAsia="Yu Gothic"/>
           <w:b/>
           <w:color w:val="1F4E79"/>
-          <w:sz w:val="20"/>
+          <w:sz w:val="19"/>
         </w:rPr>
         <w:t>この結果をどう読むか</w:t>
       </w:r>
     </w:p>
     <w:p>
       <w:pPr>
-        <w:spacing w:line="228" w:lineRule="auto" w:before="0" w:after="24"/>
+        <w:spacing w:line="221" w:lineRule="auto" w:before="0" w:after="18"/>
       </w:pPr>
       <w:r>
         <w:rPr>
@@ -248,26 +248,26 @@
           <w:b w:val="0"/>
           <w:sz w:val="16"/>
         </w:rPr>
-        <w:t>今回の結果は、「大乗仏教が突然消え、上座部仏教に置き換わった」と断定するものではありません。むしろ、古い語彙を残しながら新しい語彙を取り入れる、ゆるやかな変化の見取り図です。</w:t>
+        <w:t>今回の結果は、「大乗仏教が突然消え、上座部仏教に置き換わった」と断定するものではありません。むしろ、古い語彙を残しながら新しい語彙や僧団制度に関わる言葉を取り入れる、ゆるやかな変化の見取り図です。</w:t>
       </w:r>
     </w:p>
     <w:p>
       <w:pPr>
-        <w:spacing w:before="40" w:after="0"/>
+        <w:spacing w:before="32" w:after="0"/>
       </w:pPr>
       <w:r>
         <w:rPr>
           <w:rFonts w:ascii="Yu Gothic" w:hAnsi="Yu Gothic" w:eastAsia="Yu Gothic"/>
           <w:b/>
           <w:color w:val="1F4E79"/>
-          <w:sz w:val="20"/>
+          <w:sz w:val="19"/>
         </w:rPr>
         <w:t>市民にとっての意義</w:t>
       </w:r>
     </w:p>
     <w:p>
       <w:pPr>
-        <w:spacing w:line="228" w:lineRule="auto" w:before="0" w:after="24"/>
+        <w:spacing w:line="221" w:lineRule="auto" w:before="0" w:after="18"/>
       </w:pPr>
       <w:r>
         <w:rPr>
@@ -280,21 +280,21 @@
     </w:p>
     <w:p>
       <w:pPr>
-        <w:spacing w:before="40" w:after="0"/>
+        <w:spacing w:before="32" w:after="0"/>
       </w:pPr>
       <w:r>
         <w:rPr>
           <w:rFonts w:ascii="Yu Gothic" w:hAnsi="Yu Gothic" w:eastAsia="Yu Gothic"/>
           <w:b/>
           <w:color w:val="1F4E79"/>
-          <w:sz w:val="20"/>
+          <w:sz w:val="19"/>
         </w:rPr>
         <w:t>注意点</w:t>
       </w:r>
     </w:p>
     <w:p>
       <w:pPr>
-        <w:spacing w:line="228" w:lineRule="auto" w:after="8"/>
+        <w:spacing w:line="221" w:lineRule="auto" w:after="5"/>
         <w:ind w:left="238" w:hanging="136"/>
       </w:pPr>
       <w:r>
@@ -302,7 +302,7 @@
           <w:rFonts w:ascii="Yu Gothic" w:hAnsi="Yu Gothic" w:eastAsia="Yu Gothic"/>
           <w:b/>
           <w:color w:val="1F4E79"/>
-          <w:sz w:val="16"/>
+          <w:sz w:val="15"/>
         </w:rPr>
         <w:t xml:space="preserve">• </w:t>
       </w:r>
@@ -310,14 +310,14 @@
         <w:rPr>
           <w:rFonts w:ascii="Yu Gothic" w:hAnsi="Yu Gothic" w:eastAsia="Yu Gothic"/>
           <w:b w:val="0"/>
-          <w:sz w:val="16"/>
+          <w:sz w:val="15"/>
         </w:rPr>
         <w:t>使ったコーパスは公開デモ版で、本文は未校正・不完全な部分があります。</w:t>
       </w:r>
     </w:p>
     <w:p>
       <w:pPr>
-        <w:spacing w:line="228" w:lineRule="auto" w:after="8"/>
+        <w:spacing w:line="221" w:lineRule="auto" w:after="5"/>
         <w:ind w:left="238" w:hanging="136"/>
       </w:pPr>
       <w:r>
@@ -325,7 +325,7 @@
           <w:rFonts w:ascii="Yu Gothic" w:hAnsi="Yu Gothic" w:eastAsia="Yu Gothic"/>
           <w:b/>
           <w:color w:val="1F4E79"/>
-          <w:sz w:val="16"/>
+          <w:sz w:val="15"/>
         </w:rPr>
         <w:t xml:space="preserve">• </w:t>
       </w:r>
@@ -333,14 +333,14 @@
         <w:rPr>
           <w:rFonts w:ascii="Yu Gothic" w:hAnsi="Yu Gothic" w:eastAsia="Yu Gothic"/>
           <w:b w:val="0"/>
-          <w:sz w:val="16"/>
+          <w:sz w:val="15"/>
         </w:rPr>
-        <w:t>検索語は代表例に限られます。異表記や同義語を増やすと結果は変わる可能性があります。</w:t>
+        <w:t>検索語リストは拡張しましたが、異表記・同義語・翻訳語をさらに増やすと結果は変わる可能性があります。</w:t>
       </w:r>
     </w:p>
     <w:p>
       <w:pPr>
-        <w:spacing w:line="228" w:lineRule="auto" w:after="8"/>
+        <w:spacing w:line="221" w:lineRule="auto" w:after="5"/>
         <w:ind w:left="238" w:hanging="136"/>
       </w:pPr>
       <w:r>
@@ -348,7 +348,7 @@
           <w:rFonts w:ascii="Yu Gothic" w:hAnsi="Yu Gothic" w:eastAsia="Yu Gothic"/>
           <w:b/>
           <w:color w:val="1F4E79"/>
-          <w:sz w:val="16"/>
+          <w:sz w:val="15"/>
         </w:rPr>
         <w:t xml:space="preserve">• </w:t>
       </w:r>
@@ -356,28 +356,28 @@
         <w:rPr>
           <w:rFonts w:ascii="Yu Gothic" w:hAnsi="Yu Gothic" w:eastAsia="Yu Gothic"/>
           <w:b w:val="0"/>
-          <w:sz w:val="16"/>
+          <w:sz w:val="15"/>
         </w:rPr>
         <w:t>これは最終結論ではなく、今後どの碑文を詳しく読むべきかを決めるための地図です。</w:t>
       </w:r>
     </w:p>
     <w:p>
       <w:pPr>
-        <w:spacing w:before="40" w:after="0" w:line="216" w:lineRule="auto"/>
+        <w:spacing w:before="30" w:after="0" w:line="216" w:lineRule="auto"/>
       </w:pPr>
       <w:r>
         <w:rPr>
           <w:rFonts w:ascii="Yu Gothic" w:hAnsi="Yu Gothic" w:eastAsia="Yu Gothic"/>
           <w:b w:val="0"/>
           <w:color w:val="595959"/>
-          <w:sz w:val="14"/>
+          <w:sz w:val="13"/>
         </w:rPr>
         <w:t>出典・方法：SEAlang Corpus of Khmer Inscriptions（公開クエリ）を用いたパイロット解析。検索結果は bougtoir/wip の khmer_inscription_analysis に保存。</w:t>
       </w:r>
     </w:p>
     <w:sectPr>
       <w:pgSz w:w="11906" w:h="16838"/>
-      <w:pgMar w:top="595" w:right="765" w:bottom="567" w:left="765" w:header="720" w:footer="720" w:gutter="0"/>
+      <w:pgMar w:top="567" w:right="709" w:bottom="539" w:left="709" w:header="720" w:footer="720" w:gutter="0"/>
       <w:cols w:space="720"/>
       <w:docGrid w:linePitch="360"/>
     </w:sectPr>
@@ -750,7 +750,7 @@
     <w:rsid w:val="00FC693F"/>
     <w:rPr>
       <w:rFonts w:ascii="Yu Gothic" w:hAnsi="Yu Gothic" w:eastAsia="Yu Gothic"/>
-      <w:sz w:val="17"/>
+      <w:sz w:val="16"/>
     </w:rPr>
   </w:style>
   <w:style w:type="paragraph" w:styleId="Header">

</xml_diff>

<commit_message>
Use integer y ticks for Khmer term chart
</commit_message>
<xml_diff>
--- a/khmer_inscription_analysis/outputs/khmer_buddhism_civic_summary_ja.docx
+++ b/khmer_inscription_analysis/outputs/khmer_buddhism_civic_summary_ja.docx
@@ -108,7 +108,7 @@
       <w:r>
         <w:drawing>
           <wp:inline xmlns:a="http://schemas.openxmlformats.org/drawingml/2006/main" xmlns:pic="http://schemas.openxmlformats.org/drawingml/2006/picture">
-            <wp:extent cx="4536000" cy="1764783"/>
+            <wp:extent cx="4536000" cy="1799452"/>
             <wp:docPr id="1" name="Picture 1"/>
             <wp:cNvGraphicFramePr>
               <a:graphicFrameLocks noChangeAspect="1"/>
@@ -129,7 +129,7 @@
                   <pic:spPr>
                     <a:xfrm>
                       <a:off x="0" y="0"/>
-                      <a:ext cx="4536000" cy="1764783"/>
+                      <a:ext cx="4536000" cy="1799452"/>
                     </a:xfrm>
                     <a:prstGeom prst="rect"/>
                   </pic:spPr>

</xml_diff>